<commit_message>
Week 6 crud operations, my sql and php connections update.
</commit_message>
<xml_diff>
--- a/Documentation/Sokoni Hub Logbook.docx
+++ b/Documentation/Sokoni Hub Logbook.docx
@@ -440,16 +440,7 @@
           <w:sz w:val="20"/>
           <w:szCs w:val="20"/>
         </w:rPr>
-        <w:t>PHP, MySQL, HTML, CSS</w:t>
-      </w:r>
-      <w:r>
-        <w:rPr>
-          <w:rFonts w:ascii="Arial" w:eastAsia="Arial" w:hAnsi="Arial" w:cs="Arial"/>
-          <w:color w:val="000000"/>
-          <w:sz w:val="20"/>
-          <w:szCs w:val="20"/>
-        </w:rPr>
-        <w:t>, JavaScript</w:t>
+        <w:t>PHP, MySQL, HTML, CSS, JavaScript</w:t>
       </w:r>
       <w:r>
         <w:rPr>
@@ -572,8 +563,6 @@
           <w:rFonts w:ascii="Times New Roman" w:hAnsi="Times New Roman" w:cs="Times New Roman"/>
         </w:rPr>
       </w:pPr>
-      <w:bookmarkStart w:id="1" w:name="_GoBack"/>
-      <w:bookmarkEnd w:id="1"/>
     </w:p>
     <w:p>
       <w:pPr>
@@ -680,14 +669,14 @@
           <w:rFonts w:ascii="Times New Roman" w:hAnsi="Times New Roman" w:cs="Times New Roman"/>
         </w:rPr>
       </w:pPr>
-      <w:bookmarkStart w:id="2" w:name="_Toc231542527"/>
+      <w:bookmarkStart w:id="1" w:name="_Toc231542527"/>
       <w:r>
         <w:rPr>
           <w:rFonts w:ascii="Times New Roman" w:hAnsi="Times New Roman" w:cs="Times New Roman"/>
         </w:rPr>
         <w:t>Table of Contents</w:t>
       </w:r>
-      <w:bookmarkEnd w:id="2"/>
+      <w:bookmarkEnd w:id="1"/>
     </w:p>
     <w:sdt>
       <w:sdtPr>
@@ -3480,7 +3469,7 @@
           <w:rFonts w:ascii="Times New Roman" w:hAnsi="Times New Roman" w:cs="Times New Roman"/>
         </w:rPr>
       </w:pPr>
-      <w:bookmarkStart w:id="3" w:name="_Toc231542528"/>
+      <w:bookmarkStart w:id="2" w:name="_Toc231542528"/>
       <w:r>
         <w:rPr>
           <w:rFonts w:ascii="Times New Roman" w:eastAsia="Arial" w:hAnsi="Times New Roman" w:cs="Times New Roman"/>
@@ -3489,7 +3478,7 @@
         <w:lastRenderedPageBreak/>
         <w:t>Project Overview</w:t>
       </w:r>
-      <w:bookmarkEnd w:id="3"/>
+      <w:bookmarkEnd w:id="2"/>
     </w:p>
     <w:p>
       <w:pPr>
@@ -3566,7 +3555,7 @@
           <w:rFonts w:ascii="Times New Roman" w:hAnsi="Times New Roman" w:cs="Times New Roman"/>
         </w:rPr>
       </w:pPr>
-      <w:bookmarkStart w:id="4" w:name="_Toc231542529"/>
+      <w:bookmarkStart w:id="3" w:name="_Toc231542529"/>
       <w:r>
         <w:rPr>
           <w:rFonts w:ascii="Times New Roman" w:eastAsia="Arial" w:hAnsi="Times New Roman" w:cs="Times New Roman"/>
@@ -3574,21 +3563,7 @@
         </w:rPr>
         <w:t>Project Folder Structure</w:t>
       </w:r>
-      <w:bookmarkEnd w:id="4"/>
-    </w:p>
-    <w:p>
-      <w:pPr>
-        <w:spacing w:before="60" w:after="80"/>
-        <w:rPr>
-          <w:rFonts w:ascii="Times New Roman" w:hAnsi="Times New Roman" w:cs="Times New Roman"/>
-        </w:rPr>
-      </w:pPr>
-      <w:r>
-        <w:rPr>
-          <w:rFonts w:ascii="Times New Roman" w:eastAsia="Arial" w:hAnsi="Times New Roman" w:cs="Times New Roman"/>
-        </w:rPr>
-        <w:t>The project follows the professional folder structure introduced in Week 4:</w:t>
-      </w:r>
+      <w:bookmarkEnd w:id="3"/>
     </w:p>
     <w:p>
       <w:pPr>
@@ -3651,7 +3626,7 @@
           <w:rFonts w:ascii="Times New Roman" w:hAnsi="Times New Roman" w:cs="Times New Roman"/>
         </w:rPr>
       </w:pPr>
-      <w:bookmarkStart w:id="5" w:name="_Toc231542530"/>
+      <w:bookmarkStart w:id="4" w:name="_Toc231542530"/>
       <w:r>
         <w:rPr>
           <w:rFonts w:ascii="Times New Roman" w:hAnsi="Times New Roman" w:cs="Times New Roman"/>
@@ -3659,7 +3634,7 @@
         <w:lastRenderedPageBreak/>
         <w:t>Week 1: Local Environment Setup</w:t>
       </w:r>
-      <w:bookmarkEnd w:id="5"/>
+      <w:bookmarkEnd w:id="4"/>
     </w:p>
     <w:p>
       <w:pPr>
@@ -3674,7 +3649,7 @@
           <w:docGrid w:linePitch="360"/>
         </w:sectPr>
       </w:pPr>
-      <w:bookmarkStart w:id="6" w:name="_Toc231542531"/>
+      <w:bookmarkStart w:id="5" w:name="_Toc231542531"/>
       <w:r>
         <w:rPr>
           <w:rFonts w:ascii="Times New Roman" w:hAnsi="Times New Roman" w:cs="Times New Roman"/>
@@ -3687,13 +3662,13 @@
         </w:rPr>
         <w:t>Installation and Testing of Local Development Environment</w:t>
       </w:r>
-      <w:bookmarkEnd w:id="6"/>
+      <w:bookmarkEnd w:id="5"/>
     </w:p>
     <w:p>
       <w:pPr>
         <w:pStyle w:val="Heading3"/>
       </w:pPr>
-      <w:bookmarkStart w:id="7" w:name="_Toc231542532"/>
+      <w:bookmarkStart w:id="6" w:name="_Toc231542532"/>
       <w:r>
         <w:t>Fig 1</w:t>
       </w:r>
@@ -3701,9 +3676,14 @@
         <w:t>.1</w:t>
       </w:r>
       <w:r>
-        <w:t>: Installation of XAMPP</w:t>
-      </w:r>
+        <w:t>: Installation of XAM</w:t>
+      </w:r>
+      <w:bookmarkStart w:id="7" w:name="_GoBack"/>
       <w:bookmarkEnd w:id="7"/>
+      <w:r>
+        <w:t>PP</w:t>
+      </w:r>
+      <w:bookmarkEnd w:id="6"/>
     </w:p>
     <w:p>
       <w:pPr>
@@ -3835,19 +3815,6 @@
           </wp:inline>
         </w:drawing>
       </w:r>
-      <w:r>
-        <w:rPr>
-          <w:rFonts w:ascii="Times New Roman" w:hAnsi="Times New Roman" w:cs="Times New Roman"/>
-        </w:rPr>
-        <w:br/>
-      </w:r>
-    </w:p>
-    <w:p>
-      <w:pPr>
-        <w:rPr>
-          <w:rFonts w:ascii="Times New Roman" w:hAnsi="Times New Roman" w:cs="Times New Roman"/>
-        </w:rPr>
-      </w:pPr>
     </w:p>
     <w:p>
       <w:pPr>
@@ -3935,16 +3902,22 @@
           <w:rFonts w:ascii="Times New Roman" w:hAnsi="Times New Roman" w:cs="Times New Roman"/>
         </w:rPr>
       </w:pPr>
-      <w:r>
-        <w:rPr>
-          <w:rFonts w:ascii="Times New Roman" w:hAnsi="Times New Roman" w:cs="Times New Roman"/>
-          <w:noProof/>
+    </w:p>
+    <w:p>
+      <w:pPr>
+        <w:rPr>
+          <w:rFonts w:ascii="Times New Roman" w:hAnsi="Times New Roman" w:cs="Times New Roman"/>
+        </w:rPr>
+      </w:pPr>
+      <w:r>
+        <w:rPr>
+          <w:rFonts w:ascii="Times New Roman" w:hAnsi="Times New Roman" w:cs="Times New Roman"/>
         </w:rPr>
         <w:drawing>
-          <wp:inline distT="0" distB="0" distL="0" distR="0">
-            <wp:extent cx="3367473" cy="1781175"/>
-            <wp:effectExtent l="0" t="0" r="4445" b="0"/>
-            <wp:docPr id="5" name="Picture 5"/>
+          <wp:inline distT="0" distB="0" distL="0" distR="0" wp14:anchorId="5E5253D6" wp14:editId="30B700A9">
+            <wp:extent cx="4745736" cy="1647825"/>
+            <wp:effectExtent l="0" t="0" r="0" b="0"/>
+            <wp:docPr id="12" name="Picture 12"/>
             <wp:cNvGraphicFramePr>
               <a:graphicFrameLocks xmlns:a="http://schemas.openxmlformats.org/drawingml/2006/main" noChangeAspect="1"/>
             </wp:cNvGraphicFramePr>
@@ -3952,29 +3925,30 @@
               <a:graphicData uri="http://schemas.openxmlformats.org/drawingml/2006/picture">
                 <pic:pic xmlns:pic="http://schemas.openxmlformats.org/drawingml/2006/picture">
                   <pic:nvPicPr>
-                    <pic:cNvPr id="5" name="Screenshot 2026-06-04 104401.png"/>
+                    <pic:cNvPr id="1" name=""/>
                     <pic:cNvPicPr/>
                   </pic:nvPicPr>
-                  <pic:blipFill>
-                    <a:blip r:embed="rId13">
-                      <a:extLst>
-                        <a:ext uri="{28A0092B-C50C-407E-A947-70E740481C1C}">
-                          <a14:useLocalDpi xmlns:a14="http://schemas.microsoft.com/office/drawing/2010/main" val="0"/>
-                        </a:ext>
-                      </a:extLst>
-                    </a:blip>
-                    <a:stretch>
-                      <a:fillRect/>
-                    </a:stretch>
+                  <pic:blipFill rotWithShape="1">
+                    <a:blip r:embed="rId13"/>
+                    <a:srcRect b="59333"/>
+                    <a:stretch/>
                   </pic:blipFill>
-                  <pic:spPr>
+                  <pic:spPr bwMode="auto">
                     <a:xfrm>
                       <a:off x="0" y="0"/>
-                      <a:ext cx="3373569" cy="1784399"/>
+                      <a:ext cx="4751861" cy="1649952"/>
                     </a:xfrm>
                     <a:prstGeom prst="rect">
                       <a:avLst/>
                     </a:prstGeom>
+                    <a:ln>
+                      <a:noFill/>
+                    </a:ln>
+                    <a:extLst>
+                      <a:ext uri="{53640926-AAD7-44D8-BBD7-CCE9431645EC}">
+                        <a14:shadowObscured xmlns:a14="http://schemas.microsoft.com/office/drawing/2010/main"/>
+                      </a:ext>
+                    </a:extLst>
                   </pic:spPr>
                 </pic:pic>
               </a:graphicData>
@@ -4138,6 +4112,9 @@
     <w:p>
       <w:pPr>
         <w:pStyle w:val="Heading1"/>
+        <w:tabs>
+          <w:tab w:val="left" w:pos="5325"/>
+        </w:tabs>
         <w:rPr>
           <w:rFonts w:ascii="Times New Roman" w:hAnsi="Times New Roman" w:cs="Times New Roman"/>
         </w:rPr>
@@ -4151,15 +4128,26 @@
         <w:t>Week 2: Wireframes and GUI Design</w:t>
       </w:r>
       <w:bookmarkEnd w:id="12"/>
+      <w:r>
+        <w:rPr>
+          <w:rFonts w:ascii="Times New Roman" w:hAnsi="Times New Roman" w:cs="Times New Roman"/>
+        </w:rPr>
+        <w:tab/>
+      </w:r>
     </w:p>
     <w:p>
+      <w:bookmarkStart w:id="13" w:name="_Toc231542538"/>
+      <w:r>
+        <w:t>Planning the application visually before writing any HTML or CSS  wireframes, GUI layouts, and technology decisions.</w:t>
+      </w:r>
+    </w:p>
+    <w:p>
       <w:pPr>
         <w:pStyle w:val="Heading2"/>
         <w:rPr>
           <w:rFonts w:ascii="Times New Roman" w:hAnsi="Times New Roman" w:cs="Times New Roman"/>
         </w:rPr>
       </w:pPr>
-      <w:bookmarkStart w:id="13" w:name="_Toc231542538"/>
       <w:r>
         <w:rPr>
           <w:rFonts w:ascii="Times New Roman" w:hAnsi="Times New Roman" w:cs="Times New Roman"/>
@@ -4174,6 +4162,7 @@
       </w:r>
       <w:bookmarkEnd w:id="13"/>
     </w:p>
+    <w:p/>
     <w:p>
       <w:pPr>
         <w:pStyle w:val="Heading3"/>
@@ -4206,8 +4195,8 @@
         </w:rPr>
         <w:drawing>
           <wp:inline distT="0" distB="0" distL="0" distR="0">
-            <wp:extent cx="4626610" cy="1676400"/>
-            <wp:effectExtent l="0" t="0" r="2540" b="0"/>
+            <wp:extent cx="5126072" cy="1857375"/>
+            <wp:effectExtent l="0" t="0" r="0" b="0"/>
             <wp:docPr id="23" name="Picture 23"/>
             <wp:cNvGraphicFramePr>
               <a:graphicFrameLocks xmlns:a="http://schemas.openxmlformats.org/drawingml/2006/main" noChangeAspect="1"/>
@@ -4233,7 +4222,7 @@
                   <pic:spPr bwMode="auto">
                     <a:xfrm>
                       <a:off x="0" y="0"/>
-                      <a:ext cx="4626610" cy="1676400"/>
+                      <a:ext cx="5141569" cy="1862990"/>
                     </a:xfrm>
                     <a:prstGeom prst="rect">
                       <a:avLst/>
@@ -4253,26 +4242,23 @@
           </wp:inline>
         </w:drawing>
       </w:r>
-      <w:r>
-        <w:rPr>
-          <w:rFonts w:ascii="Times New Roman" w:hAnsi="Times New Roman" w:cs="Times New Roman"/>
-        </w:rPr>
-        <w:br/>
-      </w:r>
     </w:p>
     <w:p>
       <w:pPr>
         <w:pStyle w:val="Heading3"/>
       </w:pPr>
-      <w:bookmarkStart w:id="15" w:name="_Toc231542540"/>
-      <w:r>
-        <w:t>Fig 2</w:t>
-      </w:r>
-      <w:r>
-        <w:t>.1.2</w:t>
-      </w:r>
-      <w:r>
-        <w:t>: Dashboard Layout Design</w:t>
+      <w:bookmarkStart w:id="15" w:name="_Toc231542541"/>
+      <w:r>
+        <w:t xml:space="preserve">Fig </w:t>
+      </w:r>
+      <w:r>
+        <w:t>2.1.</w:t>
+      </w:r>
+      <w:r>
+        <w:t>2</w:t>
+      </w:r>
+      <w:r>
+        <w:t>: Mobile View Mockup</w:t>
       </w:r>
       <w:bookmarkEnd w:id="15"/>
     </w:p>
@@ -4280,18 +4266,26 @@
       <w:pPr>
         <w:rPr>
           <w:rFonts w:ascii="Times New Roman" w:hAnsi="Times New Roman" w:cs="Times New Roman"/>
-        </w:rPr>
-      </w:pPr>
-      <w:r>
-        <w:rPr>
-          <w:rFonts w:ascii="Times New Roman" w:hAnsi="Times New Roman" w:cs="Times New Roman"/>
           <w:noProof/>
         </w:rPr>
+      </w:pPr>
+    </w:p>
+    <w:p>
+      <w:pPr>
+        <w:rPr>
+          <w:rFonts w:ascii="Times New Roman" w:hAnsi="Times New Roman" w:cs="Times New Roman"/>
+        </w:rPr>
+      </w:pPr>
+      <w:r>
+        <w:rPr>
+          <w:rFonts w:ascii="Times New Roman" w:hAnsi="Times New Roman" w:cs="Times New Roman"/>
+          <w:noProof/>
+        </w:rPr>
         <w:drawing>
-          <wp:inline distT="0" distB="0" distL="0" distR="0" wp14:anchorId="33F40014" wp14:editId="32EDC422">
-            <wp:extent cx="5486400" cy="2886075"/>
-            <wp:effectExtent l="0" t="0" r="0" b="9525"/>
-            <wp:docPr id="24" name="Picture 24"/>
+          <wp:inline distT="0" distB="0" distL="0" distR="0" wp14:anchorId="6CBC6F3A" wp14:editId="792A6C72">
+            <wp:extent cx="2543175" cy="2638425"/>
+            <wp:effectExtent l="0" t="0" r="9525" b="9525"/>
+            <wp:docPr id="30" name="Picture 30"/>
             <wp:cNvGraphicFramePr>
               <a:graphicFrameLocks xmlns:a="http://schemas.openxmlformats.org/drawingml/2006/main" noChangeAspect="1"/>
             </wp:cNvGraphicFramePr>
@@ -4302,20 +4296,27 @@
                     <pic:cNvPr id="1" name=""/>
                     <pic:cNvPicPr/>
                   </pic:nvPicPr>
-                  <pic:blipFill>
+                  <pic:blipFill rotWithShape="1">
                     <a:blip r:embed="rId15"/>
-                    <a:stretch>
-                      <a:fillRect/>
-                    </a:stretch>
+                    <a:srcRect r="12074" b="10048"/>
+                    <a:stretch/>
                   </pic:blipFill>
-                  <pic:spPr>
+                  <pic:spPr bwMode="auto">
                     <a:xfrm>
                       <a:off x="0" y="0"/>
-                      <a:ext cx="5486400" cy="2886075"/>
+                      <a:ext cx="2548151" cy="2643587"/>
                     </a:xfrm>
                     <a:prstGeom prst="rect">
                       <a:avLst/>
                     </a:prstGeom>
+                    <a:ln>
+                      <a:noFill/>
+                    </a:ln>
+                    <a:extLst>
+                      <a:ext uri="{53640926-AAD7-44D8-BBD7-CCE9431645EC}">
+                        <a14:shadowObscured xmlns:a14="http://schemas.microsoft.com/office/drawing/2010/main"/>
+                      </a:ext>
+                    </a:extLst>
                   </pic:spPr>
                 </pic:pic>
               </a:graphicData>
@@ -4334,7 +4335,7 @@
       <w:pPr>
         <w:pStyle w:val="Heading3"/>
       </w:pPr>
-      <w:bookmarkStart w:id="16" w:name="_Toc231542541"/>
+      <w:bookmarkStart w:id="16" w:name="_Toc231542542"/>
       <w:r>
         <w:lastRenderedPageBreak/>
         <w:t xml:space="preserve">Fig </w:t>
@@ -4343,7 +4344,10 @@
         <w:t>2.1.</w:t>
       </w:r>
       <w:r>
-        <w:t>3: Mobile View Mockup</w:t>
+        <w:t>3</w:t>
+      </w:r>
+      <w:r>
+        <w:t>: GUI Prototype</w:t>
       </w:r>
       <w:bookmarkEnd w:id="16"/>
     </w:p>
@@ -4356,13 +4360,18 @@
       <w:r>
         <w:rPr>
           <w:rFonts w:ascii="Times New Roman" w:hAnsi="Times New Roman" w:cs="Times New Roman"/>
-          <w:noProof/>
+        </w:rPr>
+        <w:br/>
+      </w:r>
+      <w:r>
+        <w:rPr>
+          <w:rFonts w:ascii="Times New Roman" w:hAnsi="Times New Roman" w:cs="Times New Roman"/>
         </w:rPr>
         <w:drawing>
-          <wp:inline distT="0" distB="0" distL="0" distR="0" wp14:anchorId="6CBC6F3A" wp14:editId="792A6C72">
-            <wp:extent cx="2892672" cy="3409950"/>
-            <wp:effectExtent l="0" t="0" r="3175" b="0"/>
-            <wp:docPr id="30" name="Picture 30"/>
+          <wp:inline distT="0" distB="0" distL="0" distR="0" wp14:anchorId="50C84DA6" wp14:editId="5FBCDE79">
+            <wp:extent cx="5051330" cy="2838450"/>
+            <wp:effectExtent l="0" t="0" r="0" b="0"/>
+            <wp:docPr id="3" name="Picture 3"/>
             <wp:cNvGraphicFramePr>
               <a:graphicFrameLocks xmlns:a="http://schemas.openxmlformats.org/drawingml/2006/main" noChangeAspect="1"/>
             </wp:cNvGraphicFramePr>
@@ -4382,7 +4391,7 @@
                   <pic:spPr>
                     <a:xfrm>
                       <a:off x="0" y="0"/>
-                      <a:ext cx="2898084" cy="3416330"/>
+                      <a:ext cx="5054169" cy="2840045"/>
                     </a:xfrm>
                     <a:prstGeom prst="rect">
                       <a:avLst/>
@@ -4394,129 +4403,94 @@
           </wp:inline>
         </w:drawing>
       </w:r>
-      <w:r>
-        <w:rPr>
-          <w:rFonts w:ascii="Times New Roman" w:hAnsi="Times New Roman" w:cs="Times New Roman"/>
-        </w:rPr>
-        <w:br/>
-      </w:r>
     </w:p>
     <w:p>
       <w:pPr>
-        <w:pStyle w:val="Heading3"/>
-      </w:pPr>
-      <w:bookmarkStart w:id="17" w:name="_Toc231542542"/>
-      <w:r>
-        <w:t xml:space="preserve">Fig </w:t>
-      </w:r>
-      <w:r>
-        <w:t>2.1.</w:t>
-      </w:r>
-      <w:r>
-        <w:t>5: GUI Prototype</w:t>
+        <w:pStyle w:val="Heading2"/>
+      </w:pPr>
+      <w:bookmarkStart w:id="17" w:name="_Toc231542543"/>
+      <w:r>
+        <w:t xml:space="preserve">2.2 Week 2 </w:t>
+      </w:r>
+      <w:r>
+        <w:t>Reflection</w:t>
       </w:r>
       <w:bookmarkEnd w:id="17"/>
+      <w:r>
+        <w:t xml:space="preserve"> </w:t>
+      </w:r>
     </w:p>
     <w:p>
-      <w:pPr>
-        <w:rPr>
-          <w:rFonts w:ascii="Times New Roman" w:hAnsi="Times New Roman" w:cs="Times New Roman"/>
-        </w:rPr>
-      </w:pPr>
-      <w:r>
-        <w:rPr>
-          <w:rFonts w:ascii="Times New Roman" w:hAnsi="Times New Roman" w:cs="Times New Roman"/>
-        </w:rPr>
-        <w:br/>
+      <w:r>
+        <w:t>During this week, I planned the user interface and overall navigation structure for SokoniHub. Wireframes were created to visualize how users would interact with the system, including login, product browsing, shopping cart, and dashboard pages.</w:t>
       </w:r>
     </w:p>
     <w:p>
-      <w:pPr>
-        <w:pStyle w:val="Heading2"/>
-      </w:pPr>
-      <w:bookmarkStart w:id="18" w:name="_Toc231542543"/>
-      <w:r>
-        <w:t xml:space="preserve">2.2 Week 2 </w:t>
-      </w:r>
-      <w:r>
-        <w:t>Reflection</w:t>
-      </w:r>
-      <w:bookmarkEnd w:id="18"/>
-      <w:r>
-        <w:t xml:space="preserve"> </w:t>
+      <w:r>
+        <w:t xml:space="preserve"> The design focused on simplicity, accessibility, and easy navigation. A mobile-responsive layout was also considered to support users accessing the platform through smartphones. The screenshots demonstrate the design process, navigation planning, dashboard structure, color selection, and prototype development. </w:t>
       </w:r>
     </w:p>
     <w:p>
-      <w:r>
-        <w:t>During this week, I planned the user interface and overall navigation structure for SokoniHub. Wireframes were created to visualize how users would interact with the system, including login, product browsing, shopping cart, and dashboard pages.</w:t>
+      <w:pPr>
+        <w:rPr>
+          <w:rFonts w:ascii="Times New Roman" w:hAnsi="Times New Roman" w:cs="Times New Roman"/>
+        </w:rPr>
+      </w:pPr>
+      <w:r>
+        <w:t>This planning stage helped establish a clear development roadmap before implementation began.</w:t>
+      </w:r>
+      <w:r>
+        <w:rPr>
+          <w:rFonts w:ascii="Times New Roman" w:hAnsi="Times New Roman" w:cs="Times New Roman"/>
+        </w:rPr>
+        <w:br w:type="page"/>
       </w:r>
     </w:p>
     <w:p>
-      <w:r>
-        <w:t xml:space="preserve"> The design focused on simplicity, accessibility, and easy navigation. A mobile-responsive layout was also considered to support users accessing the platform through smartphones. The screenshots demonstrate the design process, navigation planning, dashboard structure, color selection, and prototype development. </w:t>
-      </w:r>
+      <w:pPr>
+        <w:pStyle w:val="Heading1"/>
+        <w:rPr>
+          <w:rFonts w:ascii="Times New Roman" w:hAnsi="Times New Roman" w:cs="Times New Roman"/>
+        </w:rPr>
+      </w:pPr>
+      <w:bookmarkStart w:id="18" w:name="_Toc231542544"/>
+      <w:r>
+        <w:rPr>
+          <w:rFonts w:ascii="Times New Roman" w:hAnsi="Times New Roman" w:cs="Times New Roman"/>
+        </w:rPr>
+        <w:lastRenderedPageBreak/>
+        <w:t>Week 3: JavaScript and PHP Basics</w:t>
+      </w:r>
+      <w:bookmarkEnd w:id="18"/>
     </w:p>
     <w:p>
       <w:pPr>
-        <w:rPr>
-          <w:rFonts w:ascii="Times New Roman" w:hAnsi="Times New Roman" w:cs="Times New Roman"/>
-        </w:rPr>
-      </w:pPr>
-      <w:r>
-        <w:t>This planning stage helped establish a clear development roadmap before implementation began.</w:t>
-      </w:r>
-      <w:r>
-        <w:rPr>
-          <w:rFonts w:ascii="Times New Roman" w:hAnsi="Times New Roman" w:cs="Times New Roman"/>
-        </w:rPr>
-        <w:br w:type="page"/>
-      </w:r>
-    </w:p>
-    <w:p>
-      <w:pPr>
-        <w:pStyle w:val="Heading1"/>
-        <w:rPr>
-          <w:rFonts w:ascii="Times New Roman" w:hAnsi="Times New Roman" w:cs="Times New Roman"/>
-        </w:rPr>
-      </w:pPr>
-      <w:bookmarkStart w:id="19" w:name="_Toc231542544"/>
-      <w:r>
-        <w:rPr>
-          <w:rFonts w:ascii="Times New Roman" w:hAnsi="Times New Roman" w:cs="Times New Roman"/>
-        </w:rPr>
-        <w:lastRenderedPageBreak/>
-        <w:t>Week 3: JavaScript and PHP Basics</w:t>
+        <w:pStyle w:val="Heading2"/>
+      </w:pPr>
+      <w:bookmarkStart w:id="19" w:name="_Toc231542545"/>
+      <w:r>
+        <w:t>3.1</w:t>
+      </w:r>
+      <w:r>
+        <w:t xml:space="preserve"> Frontend Interaction and Backend Foundations</w:t>
       </w:r>
       <w:bookmarkEnd w:id="19"/>
     </w:p>
     <w:p>
       <w:pPr>
-        <w:pStyle w:val="Heading2"/>
-      </w:pPr>
-      <w:bookmarkStart w:id="20" w:name="_Toc231542545"/>
-      <w:r>
-        <w:t>3.1</w:t>
-      </w:r>
-      <w:r>
-        <w:t xml:space="preserve"> Frontend Interaction and Backend Foundations</w:t>
+        <w:pStyle w:val="Heading3"/>
+      </w:pPr>
+      <w:bookmarkStart w:id="20" w:name="_Toc231542546"/>
+      <w:r>
+        <w:t xml:space="preserve">Fig </w:t>
+      </w:r>
+      <w:r>
+        <w:t>3.1.</w:t>
+      </w:r>
+      <w:r>
+        <w:t>1: JavaScript Form Validation</w:t>
       </w:r>
       <w:bookmarkEnd w:id="20"/>
-    </w:p>
-    <w:p>
-      <w:pPr>
-        <w:pStyle w:val="Heading3"/>
-      </w:pPr>
-      <w:bookmarkStart w:id="21" w:name="_Toc231542546"/>
-      <w:r>
-        <w:t xml:space="preserve">Fig </w:t>
-      </w:r>
-      <w:r>
-        <w:t>3.1.</w:t>
-      </w:r>
-      <w:r>
-        <w:t>1: JavaScript Form Validation</w:t>
-      </w:r>
-      <w:bookmarkEnd w:id="21"/>
     </w:p>
     <w:p>
       <w:pPr>
@@ -4576,7 +4550,7 @@
       <w:pPr>
         <w:pStyle w:val="Heading3"/>
       </w:pPr>
-      <w:bookmarkStart w:id="22" w:name="_Toc231542547"/>
+      <w:bookmarkStart w:id="21" w:name="_Toc231542547"/>
       <w:r>
         <w:t xml:space="preserve">Fig </w:t>
       </w:r>
@@ -4586,7 +4560,7 @@
       <w:r>
         <w:t>2: Password Strength Checker</w:t>
       </w:r>
-      <w:bookmarkEnd w:id="22"/>
+      <w:bookmarkEnd w:id="21"/>
     </w:p>
     <w:p>
       <w:pPr>
@@ -4646,7 +4620,7 @@
       <w:pPr>
         <w:pStyle w:val="Heading3"/>
       </w:pPr>
-      <w:bookmarkStart w:id="23" w:name="_Toc231542548"/>
+      <w:bookmarkStart w:id="22" w:name="_Toc231542548"/>
       <w:r>
         <w:lastRenderedPageBreak/>
         <w:t>Fig 3</w:t>
@@ -4657,7 +4631,7 @@
       <w:r>
         <w:t>: PHP Syntax Practice</w:t>
       </w:r>
-      <w:bookmarkEnd w:id="23"/>
+      <w:bookmarkEnd w:id="22"/>
     </w:p>
     <w:p>
       <w:pPr>
@@ -4724,7 +4698,7 @@
       <w:pPr>
         <w:pStyle w:val="Heading3"/>
       </w:pPr>
-      <w:bookmarkStart w:id="24" w:name="_Toc231542549"/>
+      <w:bookmarkStart w:id="23" w:name="_Toc231542549"/>
       <w:r>
         <w:t xml:space="preserve">Fig </w:t>
       </w:r>
@@ -4734,7 +4708,7 @@
       <w:r>
         <w:t>4: Database Connection Script</w:t>
       </w:r>
-      <w:bookmarkEnd w:id="24"/>
+      <w:bookmarkEnd w:id="23"/>
     </w:p>
     <w:p>
       <w:pPr>
@@ -4794,7 +4768,7 @@
       <w:pPr>
         <w:pStyle w:val="Heading3"/>
       </w:pPr>
-      <w:bookmarkStart w:id="25" w:name="_Toc231542550"/>
+      <w:bookmarkStart w:id="24" w:name="_Toc231542550"/>
       <w:r>
         <w:t xml:space="preserve">Fig </w:t>
       </w:r>
@@ -4804,7 +4778,7 @@
       <w:r>
         <w:t>5: Dynamic User Input Handling</w:t>
       </w:r>
-      <w:bookmarkEnd w:id="25"/>
+      <w:bookmarkEnd w:id="24"/>
     </w:p>
     <w:p>
       <w:pPr>
@@ -4864,7 +4838,7 @@
       <w:pPr>
         <w:pStyle w:val="Heading2"/>
       </w:pPr>
-      <w:bookmarkStart w:id="26" w:name="_Toc231542551"/>
+      <w:bookmarkStart w:id="25" w:name="_Toc231542551"/>
       <w:r>
         <w:lastRenderedPageBreak/>
         <w:t xml:space="preserve">3.2 </w:t>
@@ -4874,72 +4848,72 @@
       </w:r>
       <w:r>
         <w:t xml:space="preserve"> Reflection</w:t>
+      </w:r>
+      <w:bookmarkEnd w:id="25"/>
+    </w:p>
+    <w:p>
+      <w:r>
+        <w:t>This week involved learning and implementing JavaScript and PHP fundamentals required for building interactive web applications.</w:t>
+      </w:r>
+    </w:p>
+    <w:p>
+      <w:r>
+        <w:t xml:space="preserve"> JavaScript was used for form validation and improving user experience by preventing invalid submissions. PHP was used to process user inputs and communicate with the MySQL database. </w:t>
+      </w:r>
+    </w:p>
+    <w:p>
+      <w:r>
+        <w:t xml:space="preserve">I also practiced writing database connection scripts and handling dynamic form data. One challenge was understanding how frontend validation complements backend processing, which became clearer through practical implementation. </w:t>
+      </w:r>
+    </w:p>
+    <w:p>
+      <w:pPr>
+        <w:rPr>
+          <w:rFonts w:ascii="Times New Roman" w:hAnsi="Times New Roman" w:cs="Times New Roman"/>
+        </w:rPr>
+      </w:pPr>
+      <w:r>
+        <w:t>The screenshots demonstrate form validation, password checking, PHP coding exercises, database connectivity, and dynamic user input processing.</w:t>
+      </w:r>
+      <w:r>
+        <w:rPr>
+          <w:rFonts w:ascii="Times New Roman" w:hAnsi="Times New Roman" w:cs="Times New Roman"/>
+        </w:rPr>
+        <w:br w:type="page"/>
+      </w:r>
+    </w:p>
+    <w:p>
+      <w:pPr>
+        <w:pStyle w:val="Heading1"/>
+        <w:rPr>
+          <w:rFonts w:ascii="Times New Roman" w:hAnsi="Times New Roman" w:cs="Times New Roman"/>
+        </w:rPr>
+      </w:pPr>
+      <w:bookmarkStart w:id="26" w:name="_Toc231542552"/>
+      <w:r>
+        <w:rPr>
+          <w:rFonts w:ascii="Times New Roman" w:hAnsi="Times New Roman" w:cs="Times New Roman"/>
+        </w:rPr>
+        <w:lastRenderedPageBreak/>
+        <w:t>Week 4 Database creation</w:t>
       </w:r>
       <w:bookmarkEnd w:id="26"/>
     </w:p>
     <w:p>
-      <w:r>
-        <w:t>This week involved learning and implementing JavaScript and PHP fundamentals required for building interactive web applications.</w:t>
-      </w:r>
-    </w:p>
-    <w:p>
-      <w:r>
-        <w:t xml:space="preserve"> JavaScript was used for form validation and improving user experience by preventing invalid submissions. PHP was used to process user inputs and communicate with the MySQL database. </w:t>
-      </w:r>
-    </w:p>
-    <w:p>
-      <w:r>
-        <w:t xml:space="preserve">I also practiced writing database connection scripts and handling dynamic form data. One challenge was understanding how frontend validation complements backend processing, which became clearer through practical implementation. </w:t>
-      </w:r>
-    </w:p>
-    <w:p>
-      <w:pPr>
-        <w:rPr>
-          <w:rFonts w:ascii="Times New Roman" w:hAnsi="Times New Roman" w:cs="Times New Roman"/>
-        </w:rPr>
-      </w:pPr>
-      <w:r>
-        <w:t>The screenshots demonstrate form validation, password checking, PHP coding exercises, database connectivity, and dynamic user input processing.</w:t>
-      </w:r>
-      <w:r>
-        <w:rPr>
-          <w:rFonts w:ascii="Times New Roman" w:hAnsi="Times New Roman" w:cs="Times New Roman"/>
-        </w:rPr>
-        <w:br w:type="page"/>
-      </w:r>
-    </w:p>
-    <w:p>
-      <w:pPr>
-        <w:pStyle w:val="Heading1"/>
-        <w:rPr>
-          <w:rFonts w:ascii="Times New Roman" w:hAnsi="Times New Roman" w:cs="Times New Roman"/>
-        </w:rPr>
-      </w:pPr>
-      <w:bookmarkStart w:id="27" w:name="_Toc231542552"/>
-      <w:r>
-        <w:rPr>
-          <w:rFonts w:ascii="Times New Roman" w:hAnsi="Times New Roman" w:cs="Times New Roman"/>
-        </w:rPr>
-        <w:lastRenderedPageBreak/>
-        <w:t>Week 4 Database creation</w:t>
+      <w:pPr>
+        <w:pStyle w:val="Heading3"/>
+      </w:pPr>
+      <w:bookmarkStart w:id="27" w:name="_Toc231542553"/>
+      <w:r>
+        <w:t xml:space="preserve">Fig </w:t>
+      </w:r>
+      <w:r>
+        <w:t>4.</w:t>
+      </w:r>
+      <w:r>
+        <w:t>1: Database Created in phpMyAdmin</w:t>
       </w:r>
       <w:bookmarkEnd w:id="27"/>
-    </w:p>
-    <w:p>
-      <w:pPr>
-        <w:pStyle w:val="Heading3"/>
-      </w:pPr>
-      <w:bookmarkStart w:id="28" w:name="_Toc231542553"/>
-      <w:r>
-        <w:t xml:space="preserve">Fig </w:t>
-      </w:r>
-      <w:r>
-        <w:t>4.</w:t>
-      </w:r>
-      <w:r>
-        <w:t>1: Database Created in phpMyAdmin</w:t>
-      </w:r>
-      <w:bookmarkEnd w:id="28"/>
     </w:p>
     <w:p>
       <w:pPr>
@@ -4993,7 +4967,7 @@
       <w:pPr>
         <w:pStyle w:val="Heading3"/>
       </w:pPr>
-      <w:bookmarkStart w:id="29" w:name="_Toc231542554"/>
+      <w:bookmarkStart w:id="28" w:name="_Toc231542554"/>
       <w:r>
         <w:t xml:space="preserve">Fig </w:t>
       </w:r>
@@ -5003,7 +4977,7 @@
       <w:r>
         <w:t>2: Users Table Structure</w:t>
       </w:r>
-      <w:bookmarkEnd w:id="29"/>
+      <w:bookmarkEnd w:id="28"/>
     </w:p>
     <w:p>
       <w:pPr>
@@ -5057,7 +5031,7 @@
       <w:pPr>
         <w:pStyle w:val="Heading3"/>
       </w:pPr>
-      <w:bookmarkStart w:id="30" w:name="_Toc231542555"/>
+      <w:bookmarkStart w:id="29" w:name="_Toc231542555"/>
       <w:r>
         <w:lastRenderedPageBreak/>
         <w:t xml:space="preserve">Fig </w:t>
@@ -5068,7 +5042,7 @@
       <w:r>
         <w:t>3: Products Table Structure</w:t>
       </w:r>
-      <w:bookmarkEnd w:id="30"/>
+      <w:bookmarkEnd w:id="29"/>
     </w:p>
     <w:p>
       <w:pPr>
@@ -5122,7 +5096,7 @@
       <w:pPr>
         <w:pStyle w:val="Heading3"/>
       </w:pPr>
-      <w:bookmarkStart w:id="31" w:name="_Toc231542556"/>
+      <w:bookmarkStart w:id="30" w:name="_Toc231542556"/>
       <w:r>
         <w:t xml:space="preserve">Fig </w:t>
       </w:r>
@@ -5132,7 +5106,7 @@
       <w:r>
         <w:t>4: Database Relationships</w:t>
       </w:r>
-      <w:bookmarkEnd w:id="31"/>
+      <w:bookmarkEnd w:id="30"/>
     </w:p>
     <w:p>
       <w:pPr>
@@ -5192,7 +5166,7 @@
       <w:pPr>
         <w:pStyle w:val="Heading3"/>
       </w:pPr>
-      <w:bookmarkStart w:id="32" w:name="_Toc231542557"/>
+      <w:bookmarkStart w:id="31" w:name="_Toc231542557"/>
       <w:r>
         <w:t xml:space="preserve">Fig </w:t>
       </w:r>
@@ -5205,7 +5179,7 @@
       <w:r>
         <w:t>Sample Records in Database</w:t>
       </w:r>
-      <w:bookmarkEnd w:id="32"/>
+      <w:bookmarkEnd w:id="31"/>
     </w:p>
     <w:p>
       <w:pPr>
@@ -5267,145 +5241,145 @@
       <w:pPr>
         <w:pStyle w:val="Heading2"/>
       </w:pPr>
-      <w:bookmarkStart w:id="33" w:name="_Toc231542558"/>
+      <w:bookmarkStart w:id="32" w:name="_Toc231542558"/>
       <w:r>
         <w:t xml:space="preserve">4.2 </w:t>
       </w:r>
       <w:r>
         <w:t>Week 4 Reflection</w:t>
+      </w:r>
+      <w:bookmarkEnd w:id="32"/>
+    </w:p>
+    <w:p>
+      <w:pPr>
+        <w:rPr>
+          <w:rFonts w:ascii="Times New Roman" w:hAnsi="Times New Roman" w:cs="Times New Roman"/>
+          <w:sz w:val="24"/>
+        </w:rPr>
+      </w:pPr>
+      <w:r>
+        <w:rPr>
+          <w:rFonts w:ascii="Times New Roman" w:hAnsi="Times New Roman" w:cs="Times New Roman"/>
+          <w:sz w:val="24"/>
+        </w:rPr>
+        <w:t>This week focused on designing and creating the SokoniHub database using MySQL and phpMyAdmin.</w:t>
+      </w:r>
+    </w:p>
+    <w:p>
+      <w:pPr>
+        <w:rPr>
+          <w:rFonts w:ascii="Times New Roman" w:hAnsi="Times New Roman" w:cs="Times New Roman"/>
+          <w:sz w:val="24"/>
+        </w:rPr>
+      </w:pPr>
+      <w:r>
+        <w:rPr>
+          <w:rFonts w:ascii="Times New Roman" w:hAnsi="Times New Roman" w:cs="Times New Roman"/>
+          <w:sz w:val="24"/>
+        </w:rPr>
+        <w:t>Tables such as users, products, orders, and cart were created with appropriate relationships. Database normalization techniques were applied to reduce data redundancy and improve efficiency.</w:t>
+      </w:r>
+    </w:p>
+    <w:p>
+      <w:pPr>
+        <w:rPr>
+          <w:rFonts w:ascii="Times New Roman" w:hAnsi="Times New Roman" w:cs="Times New Roman"/>
+          <w:sz w:val="24"/>
+        </w:rPr>
+      </w:pPr>
+      <w:r>
+        <w:rPr>
+          <w:rFonts w:ascii="Times New Roman" w:hAnsi="Times New Roman" w:cs="Times New Roman"/>
+          <w:sz w:val="24"/>
+        </w:rPr>
+        <w:t xml:space="preserve"> A challenge encountered was establishing correct foreign key relationships between tables, which was resolved through careful planning and testing. </w:t>
+      </w:r>
+    </w:p>
+    <w:p>
+      <w:pPr>
+        <w:rPr>
+          <w:rFonts w:ascii="Times New Roman" w:hAnsi="Times New Roman" w:cs="Times New Roman"/>
+          <w:sz w:val="24"/>
+        </w:rPr>
+      </w:pPr>
+      <w:r>
+        <w:rPr>
+          <w:rFonts w:ascii="Times New Roman" w:hAnsi="Times New Roman" w:cs="Times New Roman"/>
+          <w:sz w:val="24"/>
+        </w:rPr>
+        <w:t>The screenshots demonstrate database creation, table structures, relationships, sample records, and successful database implementation. This stage provided a structured foundation for storing and managing system data.</w:t>
+      </w:r>
+    </w:p>
+    <w:p>
+      <w:pPr>
+        <w:pStyle w:val="Heading1"/>
+        <w:rPr>
+          <w:rFonts w:ascii="Times New Roman" w:hAnsi="Times New Roman" w:cs="Times New Roman"/>
+        </w:rPr>
+      </w:pPr>
+    </w:p>
+    <w:p>
+      <w:pPr>
+        <w:pStyle w:val="Heading1"/>
+        <w:rPr>
+          <w:rFonts w:ascii="Times New Roman" w:hAnsi="Times New Roman" w:cs="Times New Roman"/>
+        </w:rPr>
+      </w:pPr>
+    </w:p>
+    <w:p>
+      <w:pPr>
+        <w:pStyle w:val="Heading1"/>
+        <w:rPr>
+          <w:rFonts w:ascii="Times New Roman" w:hAnsi="Times New Roman" w:cs="Times New Roman"/>
+        </w:rPr>
+      </w:pPr>
+    </w:p>
+    <w:p>
+      <w:pPr>
+        <w:rPr>
+          <w:rFonts w:ascii="Times New Roman" w:hAnsi="Times New Roman" w:cs="Times New Roman"/>
+        </w:rPr>
+      </w:pPr>
+    </w:p>
+    <w:p>
+      <w:pPr>
+        <w:rPr>
+          <w:rFonts w:ascii="Times New Roman" w:hAnsi="Times New Roman" w:cs="Times New Roman"/>
+        </w:rPr>
+      </w:pPr>
+    </w:p>
+    <w:p>
+      <w:pPr>
+        <w:pStyle w:val="Heading1"/>
+        <w:rPr>
+          <w:rFonts w:ascii="Times New Roman" w:hAnsi="Times New Roman" w:cs="Times New Roman"/>
+        </w:rPr>
+      </w:pPr>
+      <w:bookmarkStart w:id="33" w:name="_Toc231542559"/>
+      <w:r>
+        <w:rPr>
+          <w:rFonts w:ascii="Times New Roman" w:hAnsi="Times New Roman" w:cs="Times New Roman"/>
+        </w:rPr>
+        <w:lastRenderedPageBreak/>
+        <w:t>Week 5: User Registration and Login Module</w:t>
       </w:r>
       <w:bookmarkEnd w:id="33"/>
     </w:p>
     <w:p>
       <w:pPr>
-        <w:rPr>
-          <w:rFonts w:ascii="Times New Roman" w:hAnsi="Times New Roman" w:cs="Times New Roman"/>
-          <w:sz w:val="24"/>
-        </w:rPr>
-      </w:pPr>
-      <w:r>
-        <w:rPr>
-          <w:rFonts w:ascii="Times New Roman" w:hAnsi="Times New Roman" w:cs="Times New Roman"/>
-          <w:sz w:val="24"/>
-        </w:rPr>
-        <w:t>This week focused on designing and creating the SokoniHub database using MySQL and phpMyAdmin.</w:t>
-      </w:r>
-    </w:p>
-    <w:p>
-      <w:pPr>
-        <w:rPr>
-          <w:rFonts w:ascii="Times New Roman" w:hAnsi="Times New Roman" w:cs="Times New Roman"/>
-          <w:sz w:val="24"/>
-        </w:rPr>
-      </w:pPr>
-      <w:r>
-        <w:rPr>
-          <w:rFonts w:ascii="Times New Roman" w:hAnsi="Times New Roman" w:cs="Times New Roman"/>
-          <w:sz w:val="24"/>
-        </w:rPr>
-        <w:t>Tables such as users, products, orders, and cart were created with appropriate relationships. Database normalization techniques were applied to reduce data redundancy and improve efficiency.</w:t>
-      </w:r>
-    </w:p>
-    <w:p>
-      <w:pPr>
-        <w:rPr>
-          <w:rFonts w:ascii="Times New Roman" w:hAnsi="Times New Roman" w:cs="Times New Roman"/>
-          <w:sz w:val="24"/>
-        </w:rPr>
-      </w:pPr>
-      <w:r>
-        <w:rPr>
-          <w:rFonts w:ascii="Times New Roman" w:hAnsi="Times New Roman" w:cs="Times New Roman"/>
-          <w:sz w:val="24"/>
-        </w:rPr>
-        <w:t xml:space="preserve"> A challenge encountered was establishing correct foreign key relationships between tables, which was resolved through careful planning and testing. </w:t>
-      </w:r>
-    </w:p>
-    <w:p>
-      <w:pPr>
-        <w:rPr>
-          <w:rFonts w:ascii="Times New Roman" w:hAnsi="Times New Roman" w:cs="Times New Roman"/>
-          <w:sz w:val="24"/>
-        </w:rPr>
-      </w:pPr>
-      <w:r>
-        <w:rPr>
-          <w:rFonts w:ascii="Times New Roman" w:hAnsi="Times New Roman" w:cs="Times New Roman"/>
-          <w:sz w:val="24"/>
-        </w:rPr>
-        <w:t>The screenshots demonstrate database creation, table structures, relationships, sample records, and successful database implementation. This stage provided a structured foundation for storing and managing system data.</w:t>
-      </w:r>
-    </w:p>
-    <w:p>
-      <w:pPr>
-        <w:pStyle w:val="Heading1"/>
-        <w:rPr>
-          <w:rFonts w:ascii="Times New Roman" w:hAnsi="Times New Roman" w:cs="Times New Roman"/>
-        </w:rPr>
-      </w:pPr>
-    </w:p>
-    <w:p>
-      <w:pPr>
-        <w:pStyle w:val="Heading1"/>
-        <w:rPr>
-          <w:rFonts w:ascii="Times New Roman" w:hAnsi="Times New Roman" w:cs="Times New Roman"/>
-        </w:rPr>
-      </w:pPr>
-    </w:p>
-    <w:p>
-      <w:pPr>
-        <w:pStyle w:val="Heading1"/>
-        <w:rPr>
-          <w:rFonts w:ascii="Times New Roman" w:hAnsi="Times New Roman" w:cs="Times New Roman"/>
-        </w:rPr>
-      </w:pPr>
-    </w:p>
-    <w:p>
-      <w:pPr>
-        <w:rPr>
-          <w:rFonts w:ascii="Times New Roman" w:hAnsi="Times New Roman" w:cs="Times New Roman"/>
-        </w:rPr>
-      </w:pPr>
-    </w:p>
-    <w:p>
-      <w:pPr>
-        <w:rPr>
-          <w:rFonts w:ascii="Times New Roman" w:hAnsi="Times New Roman" w:cs="Times New Roman"/>
-        </w:rPr>
-      </w:pPr>
-    </w:p>
-    <w:p>
-      <w:pPr>
-        <w:pStyle w:val="Heading1"/>
-        <w:rPr>
-          <w:rFonts w:ascii="Times New Roman" w:hAnsi="Times New Roman" w:cs="Times New Roman"/>
-        </w:rPr>
-      </w:pPr>
-      <w:bookmarkStart w:id="34" w:name="_Toc231542559"/>
-      <w:r>
-        <w:rPr>
-          <w:rFonts w:ascii="Times New Roman" w:hAnsi="Times New Roman" w:cs="Times New Roman"/>
-        </w:rPr>
-        <w:lastRenderedPageBreak/>
-        <w:t>Week 5: User Registration and Login Module</w:t>
+        <w:pStyle w:val="Heading3"/>
+      </w:pPr>
+      <w:bookmarkStart w:id="34" w:name="_Toc231542560"/>
+      <w:r>
+        <w:t>Fig</w:t>
+      </w:r>
+      <w:r>
+        <w:t>5.</w:t>
+      </w:r>
+      <w:r>
+        <w:t>1: Registration Form</w:t>
       </w:r>
       <w:bookmarkEnd w:id="34"/>
-    </w:p>
-    <w:p>
-      <w:pPr>
-        <w:pStyle w:val="Heading3"/>
-      </w:pPr>
-      <w:bookmarkStart w:id="35" w:name="_Toc231542560"/>
-      <w:r>
-        <w:t>Fig</w:t>
-      </w:r>
-      <w:r>
-        <w:t>5.</w:t>
-      </w:r>
-      <w:r>
-        <w:t>1: Registration Form</w:t>
-      </w:r>
-      <w:bookmarkEnd w:id="35"/>
     </w:p>
     <w:p>
       <w:pPr>
@@ -5466,7 +5440,7 @@
       <w:pPr>
         <w:pStyle w:val="Heading3"/>
       </w:pPr>
-      <w:bookmarkStart w:id="36" w:name="_Toc231542561"/>
+      <w:bookmarkStart w:id="35" w:name="_Toc231542561"/>
       <w:r>
         <w:t xml:space="preserve">Fig </w:t>
       </w:r>
@@ -5476,7 +5450,7 @@
       <w:r>
         <w:t>2: Login Form</w:t>
       </w:r>
-      <w:bookmarkEnd w:id="36"/>
+      <w:bookmarkEnd w:id="35"/>
     </w:p>
     <w:p>
       <w:pPr>
@@ -5490,7 +5464,7 @@
           <w:noProof/>
         </w:rPr>
         <w:drawing>
-          <wp:anchor distT="0" distB="0" distL="114300" distR="114300" simplePos="0" relativeHeight="251658240" behindDoc="0" locked="0" layoutInCell="1" allowOverlap="1" wp14:anchorId="0B9654A3" wp14:editId="2139B0AE">
+          <wp:anchor distT="0" distB="0" distL="114300" distR="114300" simplePos="0" relativeHeight="251657216" behindDoc="0" locked="0" layoutInCell="1" allowOverlap="1" wp14:anchorId="0B9654A3" wp14:editId="2139B0AE">
             <wp:simplePos x="0" y="0"/>
             <wp:positionH relativeFrom="column">
               <wp:posOffset>0</wp:posOffset>
@@ -5551,7 +5525,7 @@
       <w:pPr>
         <w:pStyle w:val="Heading3"/>
       </w:pPr>
-      <w:bookmarkStart w:id="37" w:name="_Toc231542562"/>
+      <w:bookmarkStart w:id="36" w:name="_Toc231542562"/>
       <w:r>
         <w:lastRenderedPageBreak/>
         <w:t xml:space="preserve">Fig </w:t>
@@ -5562,7 +5536,7 @@
       <w:r>
         <w:t>3: User Data Stored in Database</w:t>
       </w:r>
-      <w:bookmarkEnd w:id="37"/>
+      <w:bookmarkEnd w:id="36"/>
     </w:p>
     <w:p>
       <w:r>
@@ -5655,7 +5629,7 @@
                     <pic:cNvPicPr/>
                   </pic:nvPicPr>
                   <pic:blipFill>
-                    <a:blip r:embed="rId15"/>
+                    <a:blip r:embed="rId29"/>
                     <a:stretch>
                       <a:fillRect/>
                     </a:stretch>
@@ -5693,7 +5667,7 @@
           <w:i w:val="0"/>
         </w:rPr>
       </w:pPr>
-      <w:bookmarkStart w:id="38" w:name="_Toc231542563"/>
+      <w:bookmarkStart w:id="37" w:name="_Toc231542563"/>
       <w:r>
         <w:rPr>
           <w:rStyle w:val="Heading4Char"/>
@@ -5726,7 +5700,7 @@
         </w:rPr>
         <w:t>rd Hashing.</w:t>
       </w:r>
-      <w:bookmarkEnd w:id="38"/>
+      <w:bookmarkEnd w:id="37"/>
     </w:p>
     <w:p>
       <w:r>
@@ -5749,7 +5723,7 @@
                     <pic:cNvPicPr/>
                   </pic:nvPicPr>
                   <pic:blipFill>
-                    <a:blip r:embed="rId29"/>
+                    <a:blip r:embed="rId30"/>
                     <a:stretch>
                       <a:fillRect/>
                     </a:stretch>
@@ -5777,12 +5751,12 @@
           <w:rFonts w:ascii="Times New Roman" w:hAnsi="Times New Roman" w:cs="Times New Roman"/>
         </w:rPr>
       </w:pPr>
-      <w:bookmarkStart w:id="39" w:name="_Toc231542564"/>
+      <w:bookmarkStart w:id="38" w:name="_Toc231542564"/>
       <w:r>
         <w:lastRenderedPageBreak/>
         <w:t>5.2 Week5 Reflection</w:t>
       </w:r>
-      <w:bookmarkEnd w:id="39"/>
+      <w:bookmarkEnd w:id="38"/>
     </w:p>
     <w:p>
       <w:r>
@@ -7191,6 +7165,60 @@
     </w:lvl>
   </w:abstractNum>
   <w:abstractNum w:abstractNumId="18" w15:restartNumberingAfterBreak="0">
+    <w:nsid w:val="61030DC1"/>
+    <w:multiLevelType w:val="hybridMultilevel"/>
+    <w:tmpl w:val="A9E2C8A8"/>
+    <w:lvl w:ilvl="0" w:tplc="61EC33A6">
+      <w:start w:val="1"/>
+      <w:numFmt w:val="bullet"/>
+      <w:lvlText w:val="•"/>
+      <w:lvlJc w:val="left"/>
+      <w:pPr>
+        <w:ind w:left="720" w:hanging="360"/>
+      </w:pPr>
+    </w:lvl>
+    <w:lvl w:ilvl="1" w:tplc="E4FAE98E">
+      <w:numFmt w:val="decimal"/>
+      <w:lvlText w:val=""/>
+      <w:lvlJc w:val="left"/>
+    </w:lvl>
+    <w:lvl w:ilvl="2" w:tplc="AC14EC38">
+      <w:numFmt w:val="decimal"/>
+      <w:lvlText w:val=""/>
+      <w:lvlJc w:val="left"/>
+    </w:lvl>
+    <w:lvl w:ilvl="3" w:tplc="9E362C98">
+      <w:numFmt w:val="decimal"/>
+      <w:lvlText w:val=""/>
+      <w:lvlJc w:val="left"/>
+    </w:lvl>
+    <w:lvl w:ilvl="4" w:tplc="480C89C2">
+      <w:numFmt w:val="decimal"/>
+      <w:lvlText w:val=""/>
+      <w:lvlJc w:val="left"/>
+    </w:lvl>
+    <w:lvl w:ilvl="5" w:tplc="6CA67B50">
+      <w:numFmt w:val="decimal"/>
+      <w:lvlText w:val=""/>
+      <w:lvlJc w:val="left"/>
+    </w:lvl>
+    <w:lvl w:ilvl="6" w:tplc="4FEA139E">
+      <w:numFmt w:val="decimal"/>
+      <w:lvlText w:val=""/>
+      <w:lvlJc w:val="left"/>
+    </w:lvl>
+    <w:lvl w:ilvl="7" w:tplc="E7C8A618">
+      <w:numFmt w:val="decimal"/>
+      <w:lvlText w:val=""/>
+      <w:lvlJc w:val="left"/>
+    </w:lvl>
+    <w:lvl w:ilvl="8" w:tplc="809448C2">
+      <w:numFmt w:val="decimal"/>
+      <w:lvlText w:val=""/>
+      <w:lvlJc w:val="left"/>
+    </w:lvl>
+  </w:abstractNum>
+  <w:abstractNum w:abstractNumId="19" w15:restartNumberingAfterBreak="0">
     <w:nsid w:val="63807C62"/>
     <w:multiLevelType w:val="multilevel"/>
     <w:tmpl w:val="0B169C26"/>
@@ -7339,7 +7367,7 @@
       </w:rPr>
     </w:lvl>
   </w:abstractNum>
-  <w:abstractNum w:abstractNumId="19" w15:restartNumberingAfterBreak="0">
+  <w:abstractNum w:abstractNumId="20" w15:restartNumberingAfterBreak="0">
     <w:nsid w:val="68763BD4"/>
     <w:multiLevelType w:val="multilevel"/>
     <w:tmpl w:val="EB40A334"/>
@@ -7488,7 +7516,7 @@
       </w:rPr>
     </w:lvl>
   </w:abstractNum>
-  <w:abstractNum w:abstractNumId="20" w15:restartNumberingAfterBreak="0">
+  <w:abstractNum w:abstractNumId="21" w15:restartNumberingAfterBreak="0">
     <w:nsid w:val="6AC54773"/>
     <w:multiLevelType w:val="hybridMultilevel"/>
     <w:tmpl w:val="81286D44"/>
@@ -7601,7 +7629,7 @@
       </w:rPr>
     </w:lvl>
   </w:abstractNum>
-  <w:abstractNum w:abstractNumId="21" w15:restartNumberingAfterBreak="0">
+  <w:abstractNum w:abstractNumId="22" w15:restartNumberingAfterBreak="0">
     <w:nsid w:val="6E1E3EF3"/>
     <w:multiLevelType w:val="multilevel"/>
     <w:tmpl w:val="7F5A0C14"/>
@@ -7750,7 +7778,7 @@
       </w:rPr>
     </w:lvl>
   </w:abstractNum>
-  <w:abstractNum w:abstractNumId="22" w15:restartNumberingAfterBreak="0">
+  <w:abstractNum w:abstractNumId="23" w15:restartNumberingAfterBreak="0">
     <w:nsid w:val="71830B48"/>
     <w:multiLevelType w:val="multilevel"/>
     <w:tmpl w:val="D262A3D0"/>
@@ -7899,7 +7927,7 @@
       </w:rPr>
     </w:lvl>
   </w:abstractNum>
-  <w:abstractNum w:abstractNumId="23" w15:restartNumberingAfterBreak="0">
+  <w:abstractNum w:abstractNumId="24" w15:restartNumberingAfterBreak="0">
     <w:nsid w:val="7BE2700A"/>
     <w:multiLevelType w:val="multilevel"/>
     <w:tmpl w:val="03F4FB2A"/>
@@ -8048,7 +8076,7 @@
       </w:rPr>
     </w:lvl>
   </w:abstractNum>
-  <w:abstractNum w:abstractNumId="24" w15:restartNumberingAfterBreak="0">
+  <w:abstractNum w:abstractNumId="25" w15:restartNumberingAfterBreak="0">
     <w:nsid w:val="7EF95D3F"/>
     <w:multiLevelType w:val="hybridMultilevel"/>
     <w:tmpl w:val="FADC523E"/>
@@ -8189,13 +8217,13 @@
     <w:abstractNumId w:val="0"/>
   </w:num>
   <w:num w:numId="10">
-    <w:abstractNumId w:val="24"/>
+    <w:abstractNumId w:val="25"/>
   </w:num>
   <w:num w:numId="11">
     <w:abstractNumId w:val="10"/>
   </w:num>
   <w:num w:numId="12">
-    <w:abstractNumId w:val="23"/>
+    <w:abstractNumId w:val="24"/>
   </w:num>
   <w:num w:numId="13">
     <w:abstractNumId w:val="11"/>
@@ -8210,22 +8238,22 @@
     <w:abstractNumId w:val="17"/>
   </w:num>
   <w:num w:numId="17">
-    <w:abstractNumId w:val="18"/>
+    <w:abstractNumId w:val="19"/>
   </w:num>
   <w:num w:numId="18">
+    <w:abstractNumId w:val="23"/>
+  </w:num>
+  <w:num w:numId="19">
     <w:abstractNumId w:val="22"/>
   </w:num>
-  <w:num w:numId="19">
-    <w:abstractNumId w:val="21"/>
-  </w:num>
   <w:num w:numId="20">
-    <w:abstractNumId w:val="19"/>
+    <w:abstractNumId w:val="20"/>
   </w:num>
   <w:num w:numId="21">
     <w:abstractNumId w:val="12"/>
   </w:num>
   <w:num w:numId="22">
-    <w:abstractNumId w:val="20"/>
+    <w:abstractNumId w:val="21"/>
   </w:num>
   <w:num w:numId="23">
     <w:abstractNumId w:val="15"/>
@@ -8235,6 +8263,12 @@
   </w:num>
   <w:num w:numId="25">
     <w:abstractNumId w:val="16"/>
+  </w:num>
+  <w:num w:numId="26">
+    <w:abstractNumId w:val="18"/>
+    <w:lvlOverride w:ilvl="0">
+      <w:startOverride w:val="1"/>
+    </w:lvlOverride>
   </w:num>
 </w:numbering>
 </file>
@@ -8436,7 +8470,7 @@
     <w:lsdException w:name="Medium Shading 2 Accent 1" w:uiPriority="64"/>
     <w:lsdException w:name="Medium List 1 Accent 1" w:uiPriority="65"/>
     <w:lsdException w:name="Revision" w:semiHidden="1"/>
-    <w:lsdException w:name="List Paragraph" w:uiPriority="34" w:qFormat="1"/>
+    <w:lsdException w:name="List Paragraph" w:uiPriority="0" w:qFormat="1"/>
     <w:lsdException w:name="Quote" w:uiPriority="29" w:qFormat="1"/>
     <w:lsdException w:name="Intense Quote" w:uiPriority="30" w:qFormat="1"/>
     <w:lsdException w:name="Medium List 2 Accent 1" w:uiPriority="66"/>
@@ -9037,7 +9071,6 @@
   <w:style w:type="paragraph" w:styleId="ListParagraph">
     <w:name w:val="List Paragraph"/>
     <w:basedOn w:val="Normal"/>
-    <w:uiPriority w:val="34"/>
     <w:qFormat/>
     <w:rsid w:val="00FC693F"/>
     <w:pPr>
@@ -20064,7 +20097,7 @@
 </file>
 
 <file path=customXml/itemProps1.xml><?xml version="1.0" encoding="utf-8"?>
-<ds:datastoreItem xmlns:ds="http://schemas.openxmlformats.org/officeDocument/2006/customXml" ds:itemID="{EDDAE43E-7C7B-4E91-9F0D-E4D4E18D1C78}">
+<ds:datastoreItem xmlns:ds="http://schemas.openxmlformats.org/officeDocument/2006/customXml" ds:itemID="{10A27487-8963-43F7-94B8-B2902B3DA0A5}">
   <ds:schemaRefs>
     <ds:schemaRef ds:uri="http://schemas.openxmlformats.org/officeDocument/2006/bibliography"/>
   </ds:schemaRefs>

</xml_diff>